<commit_message>
Polish Micron section lead-ins in the Aug 21 lecture
Make the 150% cross-links (export, Meta CXL, buyback, Boise lab)
read as labeled bullets instead of run-on phrases.

Co-authored-by: choijunh-cloud <choijunh-cloud@users.noreply.github.com>
</commit_message>
<xml_diff>
--- a/lectures/8월 21일 종합 (마이크론 150%, Dudley 반론, 금리).docx
+++ b/lectures/8월 21일 종합 (마이크론 150%, Dudley 반론, 금리).docx
@@ -4457,7 +4457,7 @@
           <w:color w:val="1A1A1A"/>
           <w:sz w:val="22"/>
         </w:rPr>
-        <w:t xml:space="preserve">8월 1~20일  </w:t>
+        <w:t xml:space="preserve">8월 1~20일 — </w:t>
       </w:r>
       <w:r>
         <w:rPr>
@@ -4493,7 +4493,7 @@
           <w:color w:val="1A1A1A"/>
           <w:sz w:val="22"/>
         </w:rPr>
-        <w:t xml:space="preserve">Meta DDR4+CXL  </w:t>
+        <w:t xml:space="preserve">Meta DDR4+CXL — </w:t>
       </w:r>
       <w:r>
         <w:rPr>
@@ -4529,7 +4529,7 @@
           <w:color w:val="1A1A1A"/>
           <w:sz w:val="22"/>
         </w:rPr>
-        <w:t xml:space="preserve">마이크론 환원  </w:t>
+        <w:t xml:space="preserve">마이크론 환원 — </w:t>
       </w:r>
       <w:r>
         <w:rPr>
@@ -4565,7 +4565,7 @@
           <w:color w:val="1A1A1A"/>
           <w:sz w:val="22"/>
         </w:rPr>
-        <w:t xml:space="preserve">마이크론 연구소  </w:t>
+        <w:t xml:space="preserve">마이크론 연구소 — </w:t>
       </w:r>
       <w:r>
         <w:rPr>

</xml_diff>